<commit_message>
docs: finalize academic cover and update repository README
</commit_message>
<xml_diff>
--- a/docs/Informe_ProyectoBanco.docx
+++ b/docs/Informe_ProyectoBanco.docx
@@ -35,25 +35,22 @@
     </w:p>
     <w:p>
       <w:r>
-        <w:t>Integrantes [PENDIENTE DE COMPLETAR]</w:t>
+        <w:t>Estudiante / Integrante: Santiago Bedoya Rendon</w:t>
       </w:r>
     </w:p>
     <w:p>
       <w:r>
-        <w:t>Docente [PENDIENTE DE COMPLETAR]</w:t>
+        <w:t>Docente: Diego Jose Luis Botia Valderrama</w:t>
       </w:r>
     </w:p>
     <w:p>
       <w:r>
-        <w:t>Grupo [PENDIENTE DE COMPLETAR]</w:t>
+        <w:t>Grupo: Grupo 1</w:t>
       </w:r>
     </w:p>
     <w:p>
       <w:r>
-        <w:t xml:space="preserve">Entrega 30 de </w:t>
-      </w:r>
-      <w:r>
-        <w:t>octubre de 2026</w:t>
+        <w:t>Entrega 30 de octubre de 2026</w:t>
       </w:r>
     </w:p>
     <w:p>
@@ -2470,10 +2467,7 @@
     </w:p>
     <w:p>
       <w:r>
-        <w:t xml:space="preserve">Incluye registro, acceso y cierre de sesión, resumen de cuenta, </w:t>
-      </w:r>
-      <w:r>
-        <w:t>transferencias, histórico paginado, comprobantes y perfil de lectura. La interfaz conserva azul profundo, violeta y blanco, fuente Manrope local e iconografía SVG.</w:t>
+        <w:t>Incluye registro, acceso y cierre de sesión, resumen de cuenta, transferencias, histórico paginado, comprobantes y perfil de lectura. La interfaz conserva azul profundo, violeta y blanco, fuente Manrope local e iconografía SVG.</w:t>
       </w:r>
     </w:p>
     <w:p>
@@ -3370,13 +3364,7 @@
               <w:rPr>
                 <w:sz w:val="18"/>
               </w:rPr>
-              <w:t xml:space="preserve">Módulos, foco, responsive y </w:t>
-            </w:r>
-            <w:r>
-              <w:rPr>
-                <w:sz w:val="18"/>
-              </w:rPr>
-              <w:t>movimiento reducido</w:t>
+              <w:t>Módulos, foco, responsive y movimiento reducido</w:t>
             </w:r>
           </w:p>
         </w:tc>
@@ -3574,13 +3562,7 @@
               <w:rPr>
                 <w:sz w:val="18"/>
               </w:rPr>
-              <w:t xml:space="preserve">Java 25 y Spring Boot </w:t>
-            </w:r>
-            <w:r>
-              <w:rPr>
-                <w:sz w:val="18"/>
-              </w:rPr>
-              <w:t>4.1.2</w:t>
+              <w:t>Java 25 y Spring Boot 4.1.2</w:t>
             </w:r>
           </w:p>
         </w:tc>
@@ -4252,13 +4234,7 @@
               <w:rPr>
                 <w:sz w:val="18"/>
               </w:rPr>
-              <w:t xml:space="preserve">qrcode </w:t>
-            </w:r>
-            <w:r>
-              <w:rPr>
-                <w:sz w:val="18"/>
-              </w:rPr>
-              <w:t>1.5.4, jsQR 1.4.0 y Javadoc</w:t>
+              <w:t>qrcode 1.5.4, jsQR 1.4.0 y Javadoc</w:t>
             </w:r>
           </w:p>
         </w:tc>
@@ -4313,10 +4289,7 @@
     </w:p>
     <w:p>
       <w:r>
-        <w:t xml:space="preserve">El </w:t>
-      </w:r>
-      <w:r>
-        <w:t>navegador renderiza React y envía JSON a /api. Spring Boot valida y coordina los casos de uso; JPA y JDBC acceden a PostgreSQL. El JAR incluye los archivos compilados de React. En desarrollo Vite reenvía /api al backend local.</w:t>
+        <w:t>El navegador renderiza React y envía JSON a /api. Spring Boot valida y coordina los casos de uso; JPA y JDBC acceden a PostgreSQL. El JAR incluye los archivos compilados de React. En desarrollo Vite reenvía /api al backend local.</w:t>
       </w:r>
     </w:p>
     <w:p>
@@ -4963,13 +4936,7 @@
               <w:rPr>
                 <w:sz w:val="18"/>
               </w:rPr>
-              <w:t xml:space="preserve">owner_id UNIQUE, </w:t>
-            </w:r>
-            <w:r>
-              <w:rPr>
-                <w:sz w:val="18"/>
-              </w:rPr>
-              <w:t>número UNIQUE, balance NUMERIC(19,2) no negativo, fecha</w:t>
+              <w:t>owner_id UNIQUE, número UNIQUE, balance NUMERIC(19,2) no negativo, fecha</w:t>
             </w:r>
           </w:p>
         </w:tc>
@@ -5161,13 +5128,7 @@
               <w:rPr>
                 <w:sz w:val="18"/>
               </w:rPr>
-              <w:t xml:space="preserve">UUID, origen, destino, monto positivo, fecha y </w:t>
-            </w:r>
-            <w:r>
-              <w:rPr>
-                <w:sz w:val="18"/>
-              </w:rPr>
-              <w:t>clave</w:t>
+              <w:t>UUID, origen, destino, monto positivo, fecha y clave</w:t>
             </w:r>
           </w:p>
         </w:tc>
@@ -5206,10 +5167,7 @@
     <w:p/>
     <w:p>
       <w:r>
-        <w:t xml:space="preserve">UNIQUE(source_id, idempotency_key) impide persistir dos transferencias de la misma intención para un origen. account_number_seq asigna números de doce dígitos; los huecos tras rollback son </w:t>
-      </w:r>
-      <w:r>
-        <w:t>válidos. User, Account y Transfer tienen entidades JPA. La apertura se inserta mediante JDBC sin entidad adicional.</w:t>
+        <w:t>UNIQUE(source_id, idempotency_key) impide persistir dos transferencias de la misma intención para un origen. account_number_seq asigna números de doce dígitos; los huecos tras rollback son válidos. User, Account y Transfer tienen entidades JPA. La apertura se inserta mediante JDBC sin entidad adicional.</w:t>
       </w:r>
     </w:p>
     <w:p>
@@ -5435,10 +5393,7 @@
     </w:p>
     <w:p>
       <w:r>
-        <w:t xml:space="preserve">El titular escribe destino y monto, revisa y confirma. La intención conserva un UUID por titular en </w:t>
-      </w:r>
-      <w:r>
-        <w:t>sessionStorage. El POST lleva sesión, CSRF e Idempotency-Key. El servidor valida, bloquea ambas cuentas y comprueba replay: devuelve el recibo existente si el contenido coincide o rechaza la clave reutilizada con datos distintos.</w:t>
+        <w:t>El titular escribe destino y monto, revisa y confirma. La intención conserva un UUID por titular en sessionStorage. El POST lleva sesión, CSRF e Idempotency-Key. El servidor valida, bloquea ambas cuentas y comprueba replay: devuelve el recibo existente si el contenido coincide o rechaza la clave reutilizada con datos distintos.</w:t>
       </w:r>
     </w:p>
     <w:p>
@@ -5884,10 +5839,7 @@
     </w:p>
     <w:p>
       <w:r>
-        <w:t xml:space="preserve">Spring </w:t>
-      </w:r>
-      <w:r>
-        <w:t>Security protege /api/ excepto los endpoints públicos de acceso, registro y CSRF. Las mutaciones conservan CSRF. Cuenta e histórico se consultan desde el principal; los recibos exigen participación. Un tercero no obtiene los datos de la operación.</w:t>
+        <w:t>Spring Security protege /api/ excepto los endpoints públicos de acceso, registro y CSRF. Las mutaciones conservan CSRF. Cuenta e histórico se consultan desde el principal; los recibos exigen participación. Un tercero no obtiene los datos de la operación.</w:t>
       </w:r>
     </w:p>
     <w:p>
@@ -5906,10 +5858,7 @@
       </w:pPr>
       <w:bookmarkStart w:id="20" w:name="_Toc244204775"/>
       <w:r>
-        <w:t xml:space="preserve">21 </w:t>
-      </w:r>
-      <w:r>
-        <w:t>Pruebas realizadas</w:t>
+        <w:t>21 Pruebas realizadas</w:t>
       </w:r>
       <w:bookmarkEnd w:id="20"/>
     </w:p>
@@ -6220,13 +6169,7 @@
               <w:rPr>
                 <w:sz w:val="18"/>
               </w:rPr>
-              <w:t xml:space="preserve">14 </w:t>
-            </w:r>
-            <w:r>
-              <w:rPr>
-                <w:sz w:val="18"/>
-              </w:rPr>
-              <w:t>aprobados</w:t>
+              <w:t>14 aprobados</w:t>
             </w:r>
           </w:p>
         </w:tc>
@@ -6550,13 +6493,7 @@
               <w:rPr>
                 <w:sz w:val="18"/>
               </w:rPr>
-              <w:t xml:space="preserve">Package </w:t>
-            </w:r>
-            <w:r>
-              <w:rPr>
-                <w:sz w:val="18"/>
-              </w:rPr>
-              <w:t>backend y Javadoc</w:t>
+              <w:t>Package backend y Javadoc</w:t>
             </w:r>
           </w:p>
         </w:tc>
@@ -6625,10 +6562,7 @@
     <w:p/>
     <w:p>
       <w:r>
-        <w:t xml:space="preserve">BankIntegrationTest comprueba gasto concurrente, replay concurrente, transferencias opuestas y rollback por falla SQL. Se verifican saldos, conteo de operaciones y conservación del total. La </w:t>
-      </w:r>
-      <w:r>
-        <w:t>compilación no se presenta como prueba funcional.</w:t>
+        <w:t>BankIntegrationTest comprueba gasto concurrente, replay concurrente, transferencias opuestas y rollback por falla SQL. Se verifican saldos, conteo de operaciones y conservación del total. La compilación no se presenta como prueba funcional.</w:t>
       </w:r>
     </w:p>
     <w:p>
@@ -6823,7 +6757,7 @@
           <w:rFonts w:ascii="Consolas" w:hAnsi="Consolas"/>
           <w:sz w:val="17"/>
         </w:rPr>
-        <w:t>git switch developer</w:t>
+        <w:t>git switch main</w:t>
       </w:r>
     </w:p>
     <w:p>
@@ -6847,14 +6781,7 @@
           <w:rFonts w:ascii="Consolas" w:hAnsi="Consolas"/>
           <w:sz w:val="17"/>
         </w:rPr>
-        <w:t xml:space="preserve">npm.cmd --prefix </w:t>
-      </w:r>
-      <w:r>
-        <w:rPr>
-          <w:rFonts w:ascii="Consolas" w:hAnsi="Consolas"/>
-          <w:sz w:val="17"/>
-        </w:rPr>
-        <w:t>frontend ci</w:t>
+        <w:t>npm.cmd --prefix frontend ci</w:t>
       </w:r>
     </w:p>
     <w:p>
@@ -6895,10 +6822,7 @@
     </w:p>
     <w:p>
       <w:r>
-        <w:t xml:space="preserve">Abrir http://127.0.0.1:8080 cuando el backend esté disponible. local-db crea un clúster propio en </w:t>
-      </w:r>
-      <w:r>
-        <w:t>.local/pgdata, puerto 55432 y bases bank_demo/bank_test. Los datos no se reinician al arrancar. Para cuentas nuevas usar registro con datos ficticios.</w:t>
+        <w:t>Abrir http://127.0.0.1:8080 cuando el backend esté disponible. local-db crea un clúster propio en .local/pgdata, puerto 55432 y bases bank_demo/bank_test. Los datos no se reinician al arrancar. Para cuentas nuevas usar registro con datos ficticios.</w:t>
       </w:r>
     </w:p>
     <w:p>
@@ -7037,7 +6961,7 @@
     <w:p>
       <w:r>
         <w:lastRenderedPageBreak/>
-        <w:t>La entrega incluye informe y prompts en Markdown, Word y PDF, guía y matriz. La actualización remota permanece pendiente de autorización de push; no se confunde preparación local con publicación.</w:t>
+        <w:t>La entrega incluye informe y prompts en Markdown, Word y PDF, guía y matriz. El informe y los prompts están publicados en docs/ de main, junto con las evidencias y los resultados de verificación.</w:t>
       </w:r>
     </w:p>
     <w:p>
@@ -7057,7 +6981,7 @@
     </w:p>
     <w:p>
       <w:r>
-        <w:t>Las pruebas cubren escenarios explícitos, no ausencia universal de defectos. La revisión Git inspecciona rutas y valores locales conocidos, no es escáner exhaustivo. Los datos de autor, docente y grupo deben completarse. No se modificó main ni se hizo commit, push o merge.</w:t>
+        <w:t>Las pruebas cubren escenarios explícitos, no ausencia universal de defectos. La revisión Git inspecciona rutas y valores locales conocidos, no es escáner exhaustivo. Las correcciones documentales posteriores se preparan en developer y se integran mediante pull request hacia main.</w:t>
       </w:r>
     </w:p>
     <w:p>
@@ -7092,7 +7016,7 @@
     </w:p>
     <w:p>
       <w:r>
-        <w:t>Repositorio indicado y remoto local verificado: https://github.com/Sbedoyar/ProyectoBanco. Rama de trabajo developer; main permanece intacta. La aplicación ya está publicada según el estudiante; los documentos nuevos necesitan publicación autorizada para estar disponibles remotamente.</w:t>
+        <w:t>Repositorio publicado: https://github.com/Sbedoyar/ProyectoBanco. main es la rama principal y versión estable de la entrega académica, integrada desde developer mediante el Pull Request #1. developer es la rama de desarrollo. El informe, los prompts y las evidencias están disponibles en el repositorio; estas correcciones se preparan para un segundo pull request.</w:t>
       </w:r>
     </w:p>
     <w:p>
@@ -7107,10 +7031,7 @@
     </w:p>
     <w:p>
       <w:r>
-        <w:t xml:space="preserve">Prompts_Utilizados.docx, Prompts_Utilizados.pdf y prompts.md organizan quince fases. Se distinguen </w:t>
-      </w:r>
-      <w:r>
-        <w:t>originales completos, fragmentos y síntesis. La ausencia de prompts técnicos independientes se declara, sin inventarlos. La solicitud actual se reproduce íntegra al final.</w:t>
+        <w:t>Prompts_Utilizados.docx, Prompts_Utilizados.pdf y prompts.md organizan quince fases. Se distinguen originales completos, fragmentos y síntesis. La ausencia de prompts técnicos independientes se declara, sin inventarlos. La solicitud actual se reproduce íntegra al final.</w:t>
       </w:r>
     </w:p>
     <w:p>
@@ -7488,13 +7409,7 @@
               <w:rPr>
                 <w:sz w:val="18"/>
               </w:rPr>
-              <w:t xml:space="preserve">JUnit </w:t>
-            </w:r>
-            <w:r>
-              <w:rPr>
-                <w:sz w:val="18"/>
-              </w:rPr>
-              <w:t>historyAndReceiptsAreScopedToParticipants; movimientos.png</w:t>
+              <w:t>JUnit historyAndReceiptsAreScopedToParticipants; movimientos.png</w:t>
             </w:r>
           </w:p>
         </w:tc>
@@ -7746,13 +7661,7 @@
               <w:rPr>
                 <w:sz w:val="18"/>
               </w:rPr>
-              <w:t xml:space="preserve">Revisión de </w:t>
-            </w:r>
-            <w:r>
-              <w:rPr>
-                <w:sz w:val="18"/>
-              </w:rPr>
-              <w:t>contenido y páginas</w:t>
+              <w:t>Revisión de contenido y páginas</w:t>
             </w:r>
           </w:p>
         </w:tc>
@@ -7782,7 +7691,7 @@
               <w:rPr>
                 <w:sz w:val="18"/>
               </w:rPr>
-              <w:t>Preparado localmente</w:t>
+              <w:t>Publicado en docs/</w:t>
             </w:r>
           </w:p>
         </w:tc>
@@ -7849,7 +7758,7 @@
               <w:rPr>
                 <w:sz w:val="18"/>
               </w:rPr>
-              <w:t>Remoto Sbedoyar/ProyectoBanco, developer</w:t>
+              <w:t>Repositorio Sbedoyar/ProyectoBanco, main</w:t>
             </w:r>
           </w:p>
         </w:tc>
@@ -7879,7 +7788,7 @@
               <w:rPr>
                 <w:sz w:val="18"/>
               </w:rPr>
-              <w:t>Inspección Git; sin push de esta entrega</w:t>
+              <w:t>Entrega integrada mediante PR #1</w:t>
             </w:r>
           </w:p>
         </w:tc>
@@ -7909,7 +7818,7 @@
               <w:rPr>
                 <w:sz w:val="18"/>
               </w:rPr>
-              <w:t>Publicación documental pendiente</w:t>
+              <w:t>Publicado en main</w:t>
             </w:r>
           </w:p>
         </w:tc>
@@ -8035,13 +7944,7 @@
               <w:rPr>
                 <w:sz w:val="18"/>
               </w:rPr>
-              <w:t xml:space="preserve">Preparado </w:t>
-            </w:r>
-            <w:r>
-              <w:rPr>
-                <w:sz w:val="18"/>
-              </w:rPr>
-              <w:t>localmente</w:t>
+              <w:t>Publicado en docs/</w:t>
             </w:r>
           </w:p>
         </w:tc>

</xml_diff>